<commit_message>
PSQ: fix non-clickable NABH citation URLs
Converted the NABH citation link across all 7 PSQ files (several
files cite it more than once, in multiple sub-sections) from plain
text containing a URL into real clickable OOXML hyperlinks.

Co-Authored-By: Claude Sonnet 5 <noreply@anthropic.com>
Claude-Session: https://claude.ai/code/session_016VFLsECWt4VArpBiaqgrgF
</commit_message>
<xml_diff>
--- a/policies/build/chapters_v2/PSQ/document/PSQ_Package_v2/PSQ1/SOP_PSQ1_patient_safety_programme.docx
+++ b/policies/build/chapters_v2/PSQ/document/PSQ_Package_v2/PSQ1/SOP_PSQ1_patient_safety_programme.docx
@@ -717,13 +717,16 @@
       <w:pPr>
         <w:pStyle w:val="ListParagraph"/>
       </w:pPr>
-      <w:r>
-        <w:rPr>
-          <w:i/>
-          <w:sz w:val="18"/>
-        </w:rPr>
-        <w:t>National Accreditation Board for Hospitals and Healthcare Providers. (2025). NABH accreditation standards for hospitals (6th ed.), PSQ.1. ISBN 978-81-965264-9-8. https://portal.nabh.co/images/Standards/NABH%20Hospital%20Accreditation%20Standard%206th%20Edition%20January%202025.pdf</w:t>
-      </w:r>
+      <w:hyperlink r:id="rId15">
+        <w:r>
+          <w:rPr>
+            <w:rStyle w:val="Hyperlink"/>
+            <w:i/>
+            <w:sz w:val="18"/>
+          </w:rPr>
+          <w:t>National Accreditation Board for Hospitals and Healthcare Providers. (2025). NABH accreditation standards for hospitals (6th ed.), PSQ.1. ISBN 978-81-965264-9-8. https://portal.nabh.co/images/Standards/NABH%20Hospital%20Accreditation%20Standard%206th%20Edition%20January%202025.pdf</w:t>
+        </w:r>
+      </w:hyperlink>
     </w:p>
     <w:p>
       <w:pPr>
@@ -837,13 +840,16 @@
       <w:pPr>
         <w:pStyle w:val="ListParagraph"/>
       </w:pPr>
-      <w:r>
-        <w:rPr>
-          <w:i/>
-          <w:sz w:val="18"/>
-        </w:rPr>
-        <w:t>National Accreditation Board for Hospitals and Healthcare Providers. (2025). NABH accreditation standards for hospitals (6th ed.), PSQ.1. ISBN 978-81-965264-9-8. https://portal.nabh.co/images/Standards/NABH%20Hospital%20Accreditation%20Standard%206th%20Edition%20January%202025.pdf</w:t>
-      </w:r>
+      <w:hyperlink r:id="rId15">
+        <w:r>
+          <w:rPr>
+            <w:rStyle w:val="Hyperlink"/>
+            <w:i/>
+            <w:sz w:val="18"/>
+          </w:rPr>
+          <w:t>National Accreditation Board for Hospitals and Healthcare Providers. (2025). NABH accreditation standards for hospitals (6th ed.), PSQ.1. ISBN 978-81-965264-9-8. https://portal.nabh.co/images/Standards/NABH%20Hospital%20Accreditation%20Standard%206th%20Edition%20January%202025.pdf</w:t>
+        </w:r>
+      </w:hyperlink>
     </w:p>
     <w:p>
       <w:pPr>
@@ -1002,12 +1008,15 @@
       <w:pPr>
         <w:pStyle w:val="ListParagraph"/>
       </w:pPr>
-      <w:r>
-        <w:rPr>
-          <w:i/>
-        </w:rPr>
-        <w:t>National Accreditation Board for Hospitals and Healthcare Providers. (2025). NABH accreditation standards for hospitals (6th ed.), PSQ.1. ISBN 978-81-965264-9-8. https://portal.nabh.co/images/Standards/NABH%20Hospital%20Accreditation%20Standard%206th%20Edition%20January%202025.pdf</w:t>
-      </w:r>
+      <w:hyperlink r:id="rId15">
+        <w:r>
+          <w:rPr>
+            <w:rStyle w:val="Hyperlink"/>
+            <w:i/>
+          </w:rPr>
+          <w:t>National Accreditation Board for Hospitals and Healthcare Providers. (2025). NABH accreditation standards for hospitals (6th ed.), PSQ.1. ISBN 978-81-965264-9-8. https://portal.nabh.co/images/Standards/NABH%20Hospital%20Accreditation%20Standard%206th%20Edition%20January%202025.pdf</w:t>
+        </w:r>
+      </w:hyperlink>
     </w:p>
     <w:p>
       <w:pPr>

</xml_diff>